<commit_message>
Updates for sprint 18 review documents dev: jhaynes
</commit_message>
<xml_diff>
--- a/documentation/word/Relay-Studio-Sprint-Portfolio.docx
+++ b/documentation/word/Relay-Studio-Sprint-Portfolio.docx
@@ -53,7 +53,7 @@
         <w:rPr>
           <w:color w:val="5F6B7A"/>
         </w:rPr>
-        <w:t>Version 1.2 | Sprint 17 | July 2026</w:t>
+        <w:t>Version 1.3 | Sprint 18 Plan | July 2026</w:t>
       </w:r>
     </w:p>
     <w:p>
@@ -89,7 +89,7 @@
     <w:p>
       <w:pPr>
         <w:pStyle w:val="ListBullet"/>
-        <w:spacing w:after="80"/>
+        <w:spacing w:after="40"/>
         <w:ind w:left="540" w:hanging="271"/>
       </w:pPr>
       <w:r>
@@ -99,7 +99,7 @@
     <w:p>
       <w:pPr>
         <w:pStyle w:val="ListBullet"/>
-        <w:spacing w:after="80"/>
+        <w:spacing w:after="40"/>
         <w:ind w:left="540" w:hanging="271"/>
       </w:pPr>
       <w:r>
@@ -109,7 +109,7 @@
     <w:p>
       <w:pPr>
         <w:pStyle w:val="ListBullet"/>
-        <w:spacing w:after="80"/>
+        <w:spacing w:after="40"/>
         <w:ind w:left="540" w:hanging="271"/>
       </w:pPr>
       <w:r>
@@ -119,7 +119,7 @@
     <w:p>
       <w:pPr>
         <w:pStyle w:val="ListBullet"/>
-        <w:spacing w:after="80"/>
+        <w:spacing w:after="40"/>
         <w:ind w:left="540" w:hanging="271"/>
       </w:pPr>
       <w:r>
@@ -129,7 +129,7 @@
     <w:p>
       <w:pPr>
         <w:pStyle w:val="ListBullet"/>
-        <w:spacing w:after="80"/>
+        <w:spacing w:after="40"/>
         <w:ind w:left="540" w:hanging="271"/>
       </w:pPr>
       <w:r>
@@ -139,7 +139,7 @@
     <w:p>
       <w:pPr>
         <w:pStyle w:val="ListBullet"/>
-        <w:spacing w:after="80"/>
+        <w:spacing w:after="40"/>
         <w:ind w:left="540" w:hanging="271"/>
       </w:pPr>
       <w:r>
@@ -149,7 +149,7 @@
     <w:p>
       <w:pPr>
         <w:pStyle w:val="ListBullet"/>
-        <w:spacing w:after="80"/>
+        <w:spacing w:after="40"/>
         <w:ind w:left="540" w:hanging="271"/>
       </w:pPr>
       <w:r>
@@ -159,7 +159,7 @@
     <w:p>
       <w:pPr>
         <w:pStyle w:val="ListBullet"/>
-        <w:spacing w:after="80"/>
+        <w:spacing w:after="40"/>
         <w:ind w:left="540" w:hanging="271"/>
       </w:pPr>
       <w:r>
@@ -169,7 +169,7 @@
     <w:p>
       <w:pPr>
         <w:pStyle w:val="ListBullet"/>
-        <w:spacing w:after="80"/>
+        <w:spacing w:after="40"/>
         <w:ind w:left="540" w:hanging="271"/>
       </w:pPr>
       <w:r>
@@ -179,7 +179,7 @@
     <w:p>
       <w:pPr>
         <w:pStyle w:val="ListBullet"/>
-        <w:spacing w:after="80"/>
+        <w:spacing w:after="40"/>
         <w:ind w:left="540" w:hanging="271"/>
       </w:pPr>
       <w:r>
@@ -189,7 +189,7 @@
     <w:p>
       <w:pPr>
         <w:pStyle w:val="ListBullet"/>
-        <w:spacing w:after="80"/>
+        <w:spacing w:after="40"/>
         <w:ind w:left="540" w:hanging="271"/>
       </w:pPr>
       <w:r>
@@ -199,7 +199,7 @@
     <w:p>
       <w:pPr>
         <w:pStyle w:val="ListBullet"/>
-        <w:spacing w:after="80"/>
+        <w:spacing w:after="40"/>
         <w:ind w:left="540" w:hanging="271"/>
       </w:pPr>
       <w:r>
@@ -209,7 +209,7 @@
     <w:p>
       <w:pPr>
         <w:pStyle w:val="ListBullet"/>
-        <w:spacing w:after="80"/>
+        <w:spacing w:after="40"/>
         <w:ind w:left="540" w:hanging="271"/>
       </w:pPr>
       <w:r>
@@ -219,7 +219,7 @@
     <w:p>
       <w:pPr>
         <w:pStyle w:val="ListBullet"/>
-        <w:spacing w:after="80"/>
+        <w:spacing w:after="40"/>
         <w:ind w:left="540" w:hanging="271"/>
       </w:pPr>
       <w:r>
@@ -229,7 +229,7 @@
     <w:p>
       <w:pPr>
         <w:pStyle w:val="ListBullet"/>
-        <w:spacing w:after="80"/>
+        <w:spacing w:after="40"/>
         <w:ind w:left="540" w:hanging="271"/>
       </w:pPr>
       <w:r>
@@ -239,7 +239,7 @@
     <w:p>
       <w:pPr>
         <w:pStyle w:val="ListBullet"/>
-        <w:spacing w:after="80"/>
+        <w:spacing w:after="40"/>
         <w:ind w:left="540" w:hanging="271"/>
       </w:pPr>
       <w:r>
@@ -249,7 +249,7 @@
     <w:p>
       <w:pPr>
         <w:pStyle w:val="ListBullet"/>
-        <w:spacing w:after="80"/>
+        <w:spacing w:after="40"/>
         <w:ind w:left="540" w:hanging="271"/>
       </w:pPr>
       <w:r>
@@ -259,7 +259,7 @@
     <w:p>
       <w:pPr>
         <w:pStyle w:val="ListBullet"/>
-        <w:spacing w:after="80"/>
+        <w:spacing w:after="40"/>
         <w:ind w:left="540" w:hanging="271"/>
       </w:pPr>
       <w:r>
@@ -269,7 +269,7 @@
     <w:p>
       <w:pPr>
         <w:pStyle w:val="ListBullet"/>
-        <w:spacing w:after="80"/>
+        <w:spacing w:after="40"/>
         <w:ind w:left="540" w:hanging="271"/>
       </w:pPr>
       <w:r>
@@ -279,11 +279,26 @@
     <w:p>
       <w:pPr>
         <w:pStyle w:val="ListBullet"/>
-        <w:spacing w:after="80"/>
+        <w:spacing w:after="40"/>
+        <w:ind w:left="540" w:hanging="271"/>
+      </w:pPr>
+      <w:r>
+        <w:t>Sprint 18 (planned)</w:t>
+      </w:r>
+    </w:p>
+    <w:p>
+      <w:pPr>
+        <w:pStyle w:val="ListBullet"/>
+        <w:spacing w:after="40"/>
         <w:ind w:left="540" w:hanging="271"/>
       </w:pPr>
       <w:r>
         <w:t>Standing Product Decisions</w:t>
+      </w:r>
+    </w:p>
+    <w:p>
+      <w:r>
+        <w:br w:type="page"/>
       </w:r>
     </w:p>
     <w:p>
@@ -314,26 +329,6 @@
     </w:p>
     <w:p>
       <w:pPr>
-        <w:pStyle w:val="ListBullet"/>
-        <w:spacing w:after="80"/>
-        <w:ind w:left="540" w:hanging="271"/>
-      </w:pPr>
-      <w:r>
-        <w:t>Status and detailed acceptance evidence are summarized from the former sprint-specific records.</w:t>
-      </w:r>
-    </w:p>
-    <w:p>
-      <w:pPr>
-        <w:pStyle w:val="ListBullet"/>
-        <w:spacing w:after="80"/>
-        <w:ind w:left="540" w:hanging="271"/>
-      </w:pPr>
-      <w:r>
-        <w:t>Current behavior must be verified through the Test and QA Manual and retained directives.</w:t>
-      </w:r>
-    </w:p>
-    <w:p>
-      <w:pPr>
         <w:pStyle w:val="Heading1"/>
       </w:pPr>
       <w:r>
@@ -343,26 +338,6 @@
     <w:p>
       <w:r>
         <w:t>Defined the IDE-style shell, terminology, navigation, command placement, import workflow, and testing strategy.</w:t>
-      </w:r>
-    </w:p>
-    <w:p>
-      <w:pPr>
-        <w:pStyle w:val="ListBullet"/>
-        <w:spacing w:after="80"/>
-        <w:ind w:left="540" w:hanging="271"/>
-      </w:pPr>
-      <w:r>
-        <w:t>Status and detailed acceptance evidence are summarized from the former sprint-specific records.</w:t>
-      </w:r>
-    </w:p>
-    <w:p>
-      <w:pPr>
-        <w:pStyle w:val="ListBullet"/>
-        <w:spacing w:after="80"/>
-        <w:ind w:left="540" w:hanging="271"/>
-      </w:pPr>
-      <w:r>
-        <w:t>Current behavior must be verified through the Test and QA Manual and retained directives.</w:t>
       </w:r>
     </w:p>
     <w:p>
@@ -380,26 +355,6 @@
     </w:p>
     <w:p>
       <w:pPr>
-        <w:pStyle w:val="ListBullet"/>
-        <w:spacing w:after="80"/>
-        <w:ind w:left="540" w:hanging="271"/>
-      </w:pPr>
-      <w:r>
-        <w:t>Status and detailed acceptance evidence are summarized from the former sprint-specific records.</w:t>
-      </w:r>
-    </w:p>
-    <w:p>
-      <w:pPr>
-        <w:pStyle w:val="ListBullet"/>
-        <w:spacing w:after="80"/>
-        <w:ind w:left="540" w:hanging="271"/>
-      </w:pPr>
-      <w:r>
-        <w:t>Current behavior must be verified through the Test and QA Manual and retained directives.</w:t>
-      </w:r>
-    </w:p>
-    <w:p>
-      <w:pPr>
         <w:pStyle w:val="Heading1"/>
       </w:pPr>
       <w:r>
@@ -409,26 +364,6 @@
     <w:p>
       <w:r>
         <w:t>Added project lifecycle, validation, dirty state, recent projects, native persistence, and recovery groundwork.</w:t>
-      </w:r>
-    </w:p>
-    <w:p>
-      <w:pPr>
-        <w:pStyle w:val="ListBullet"/>
-        <w:spacing w:after="80"/>
-        <w:ind w:left="540" w:hanging="271"/>
-      </w:pPr>
-      <w:r>
-        <w:t>Status and detailed acceptance evidence are summarized from the former sprint-specific records.</w:t>
-      </w:r>
-    </w:p>
-    <w:p>
-      <w:pPr>
-        <w:pStyle w:val="ListBullet"/>
-        <w:spacing w:after="80"/>
-        <w:ind w:left="540" w:hanging="271"/>
-      </w:pPr>
-      <w:r>
-        <w:t>Current behavior must be verified through the Test and QA Manual and retained directives.</w:t>
       </w:r>
     </w:p>
     <w:p>
@@ -446,26 +381,6 @@
     </w:p>
     <w:p>
       <w:pPr>
-        <w:pStyle w:val="ListBullet"/>
-        <w:spacing w:after="80"/>
-        <w:ind w:left="540" w:hanging="271"/>
-      </w:pPr>
-      <w:r>
-        <w:t>Status and detailed acceptance evidence are summarized from the former sprint-specific records.</w:t>
-      </w:r>
-    </w:p>
-    <w:p>
-      <w:pPr>
-        <w:pStyle w:val="ListBullet"/>
-        <w:spacing w:after="80"/>
-        <w:ind w:left="540" w:hanging="271"/>
-      </w:pPr>
-      <w:r>
-        <w:t>Current behavior must be verified through the Test and QA Manual and retained directives.</w:t>
-      </w:r>
-    </w:p>
-    <w:p>
-      <w:pPr>
         <w:pStyle w:val="Heading1"/>
       </w:pPr>
       <w:r>
@@ -475,26 +390,6 @@
     <w:p>
       <w:r>
         <w:t>Added native request execution, response formatting, visible console diagnostics, and controlled failure testing.</w:t>
-      </w:r>
-    </w:p>
-    <w:p>
-      <w:pPr>
-        <w:pStyle w:val="ListBullet"/>
-        <w:spacing w:after="80"/>
-        <w:ind w:left="540" w:hanging="271"/>
-      </w:pPr>
-      <w:r>
-        <w:t>Status and detailed acceptance evidence are summarized from the former sprint-specific records.</w:t>
-      </w:r>
-    </w:p>
-    <w:p>
-      <w:pPr>
-        <w:pStyle w:val="ListBullet"/>
-        <w:spacing w:after="80"/>
-        <w:ind w:left="540" w:hanging="271"/>
-      </w:pPr>
-      <w:r>
-        <w:t>Current behavior must be verified through the Test and QA Manual and retained directives.</w:t>
       </w:r>
     </w:p>
     <w:p>
@@ -512,26 +407,6 @@
     </w:p>
     <w:p>
       <w:pPr>
-        <w:pStyle w:val="ListBullet"/>
-        <w:spacing w:after="80"/>
-        <w:ind w:left="540" w:hanging="271"/>
-      </w:pPr>
-      <w:r>
-        <w:t>Status and detailed acceptance evidence are summarized from the former sprint-specific records.</w:t>
-      </w:r>
-    </w:p>
-    <w:p>
-      <w:pPr>
-        <w:pStyle w:val="ListBullet"/>
-        <w:spacing w:after="80"/>
-        <w:ind w:left="540" w:hanging="271"/>
-      </w:pPr>
-      <w:r>
-        <w:t>Current behavior must be verified through the Test and QA Manual and retained directives.</w:t>
-      </w:r>
-    </w:p>
-    <w:p>
-      <w:pPr>
         <w:pStyle w:val="Heading1"/>
       </w:pPr>
       <w:r>
@@ -541,26 +416,6 @@
     <w:p>
       <w:r>
         <w:t>Delivered visual flow composition, branching, ordering, validation, execution, and simplified workbench UX.</w:t>
-      </w:r>
-    </w:p>
-    <w:p>
-      <w:pPr>
-        <w:pStyle w:val="ListBullet"/>
-        <w:spacing w:after="80"/>
-        <w:ind w:left="540" w:hanging="271"/>
-      </w:pPr>
-      <w:r>
-        <w:t>Status and detailed acceptance evidence are summarized from the former sprint-specific records.</w:t>
-      </w:r>
-    </w:p>
-    <w:p>
-      <w:pPr>
-        <w:pStyle w:val="ListBullet"/>
-        <w:spacing w:after="80"/>
-        <w:ind w:left="540" w:hanging="271"/>
-      </w:pPr>
-      <w:r>
-        <w:t>Current behavior must be verified through the Test and QA Manual and retained directives.</w:t>
       </w:r>
     </w:p>
     <w:p>
@@ -578,26 +433,6 @@
     </w:p>
     <w:p>
       <w:pPr>
-        <w:pStyle w:val="ListBullet"/>
-        <w:spacing w:after="80"/>
-        <w:ind w:left="540" w:hanging="271"/>
-      </w:pPr>
-      <w:r>
-        <w:t>Status and detailed acceptance evidence are summarized from the former sprint-specific records.</w:t>
-      </w:r>
-    </w:p>
-    <w:p>
-      <w:pPr>
-        <w:pStyle w:val="ListBullet"/>
-        <w:spacing w:after="80"/>
-        <w:ind w:left="540" w:hanging="271"/>
-      </w:pPr>
-      <w:r>
-        <w:t>Current behavior must be verified through the Test and QA Manual and retained directives.</w:t>
-      </w:r>
-    </w:p>
-    <w:p>
-      <w:pPr>
         <w:pStyle w:val="Heading1"/>
       </w:pPr>
       <w:r>
@@ -607,26 +442,6 @@
     <w:p>
       <w:r>
         <w:t>Unified shared/native shell commands, navigation, recent projects, inspector ownership, and status messaging.</w:t>
-      </w:r>
-    </w:p>
-    <w:p>
-      <w:pPr>
-        <w:pStyle w:val="ListBullet"/>
-        <w:spacing w:after="80"/>
-        <w:ind w:left="540" w:hanging="271"/>
-      </w:pPr>
-      <w:r>
-        <w:t>Status and detailed acceptance evidence are summarized from the former sprint-specific records.</w:t>
-      </w:r>
-    </w:p>
-    <w:p>
-      <w:pPr>
-        <w:pStyle w:val="ListBullet"/>
-        <w:spacing w:after="80"/>
-        <w:ind w:left="540" w:hanging="271"/>
-      </w:pPr>
-      <w:r>
-        <w:t>Current behavior must be verified through the Test and QA Manual and retained directives.</w:t>
       </w:r>
     </w:p>
     <w:p>
@@ -644,26 +459,6 @@
     </w:p>
     <w:p>
       <w:pPr>
-        <w:pStyle w:val="ListBullet"/>
-        <w:spacing w:after="80"/>
-        <w:ind w:left="540" w:hanging="271"/>
-      </w:pPr>
-      <w:r>
-        <w:t>Status and detailed acceptance evidence are summarized from the former sprint-specific records.</w:t>
-      </w:r>
-    </w:p>
-    <w:p>
-      <w:pPr>
-        <w:pStyle w:val="ListBullet"/>
-        <w:spacing w:after="80"/>
-        <w:ind w:left="540" w:hanging="271"/>
-      </w:pPr>
-      <w:r>
-        <w:t>Current behavior must be verified through the Test and QA Manual and retained directives.</w:t>
-      </w:r>
-    </w:p>
-    <w:p>
-      <w:pPr>
         <w:pStyle w:val="Heading1"/>
       </w:pPr>
       <w:r>
@@ -673,26 +468,6 @@
     <w:p>
       <w:r>
         <w:t>Hardened configurable live REST acceptance with local-only credentials, explicit skips, target validation, and redaction assertions.</w:t>
-      </w:r>
-    </w:p>
-    <w:p>
-      <w:pPr>
-        <w:pStyle w:val="ListBullet"/>
-        <w:spacing w:after="80"/>
-        <w:ind w:left="540" w:hanging="271"/>
-      </w:pPr>
-      <w:r>
-        <w:t>Status and detailed acceptance evidence are summarized from the former sprint-specific records.</w:t>
-      </w:r>
-    </w:p>
-    <w:p>
-      <w:pPr>
-        <w:pStyle w:val="ListBullet"/>
-        <w:spacing w:after="80"/>
-        <w:ind w:left="540" w:hanging="271"/>
-      </w:pPr>
-      <w:r>
-        <w:t>Current behavior must be verified through the Test and QA Manual and retained directives.</w:t>
       </w:r>
     </w:p>
     <w:p>
@@ -710,26 +485,6 @@
     </w:p>
     <w:p>
       <w:pPr>
-        <w:pStyle w:val="ListBullet"/>
-        <w:spacing w:after="80"/>
-        <w:ind w:left="540" w:hanging="271"/>
-      </w:pPr>
-      <w:r>
-        <w:t>Status and detailed acceptance evidence are summarized from the former sprint-specific records.</w:t>
-      </w:r>
-    </w:p>
-    <w:p>
-      <w:pPr>
-        <w:pStyle w:val="ListBullet"/>
-        <w:spacing w:after="80"/>
-        <w:ind w:left="540" w:hanging="271"/>
-      </w:pPr>
-      <w:r>
-        <w:t>Current behavior must be verified through the Test and QA Manual and retained directives.</w:t>
-      </w:r>
-    </w:p>
-    <w:p>
-      <w:pPr>
         <w:pStyle w:val="Heading1"/>
       </w:pPr>
       <w:r>
@@ -739,26 +494,6 @@
     <w:p>
       <w:r>
         <w:t>Enforced coverage, types, lint, component/UI/Rust tests, dependency/license audits, secret scanning, and release-gate policy.</w:t>
-      </w:r>
-    </w:p>
-    <w:p>
-      <w:pPr>
-        <w:pStyle w:val="ListBullet"/>
-        <w:spacing w:after="80"/>
-        <w:ind w:left="540" w:hanging="271"/>
-      </w:pPr>
-      <w:r>
-        <w:t>Status and detailed acceptance evidence are summarized from the former sprint-specific records.</w:t>
-      </w:r>
-    </w:p>
-    <w:p>
-      <w:pPr>
-        <w:pStyle w:val="ListBullet"/>
-        <w:spacing w:after="80"/>
-        <w:ind w:left="540" w:hanging="271"/>
-      </w:pPr>
-      <w:r>
-        <w:t>Current behavior must be verified through the Test and QA Manual and retained directives.</w:t>
       </w:r>
     </w:p>
     <w:p>
@@ -776,26 +511,6 @@
     </w:p>
     <w:p>
       <w:pPr>
-        <w:pStyle w:val="ListBullet"/>
-        <w:spacing w:after="80"/>
-        <w:ind w:left="540" w:hanging="271"/>
-      </w:pPr>
-      <w:r>
-        <w:t>Status and detailed acceptance evidence are summarized from the former sprint-specific records.</w:t>
-      </w:r>
-    </w:p>
-    <w:p>
-      <w:pPr>
-        <w:pStyle w:val="ListBullet"/>
-        <w:spacing w:after="80"/>
-        <w:ind w:left="540" w:hanging="271"/>
-      </w:pPr>
-      <w:r>
-        <w:t>Current behavior must be verified through the Test and QA Manual and retained directives.</w:t>
-      </w:r>
-    </w:p>
-    <w:p>
-      <w:pPr>
         <w:pStyle w:val="Heading1"/>
       </w:pPr>
       <w:r>
@@ -805,26 +520,6 @@
     <w:p>
       <w:r>
         <w:t>Creates the authoritative Word library, editable Visio UML atlas, onboarding/debugging guide, and curated documentation migration.</w:t>
-      </w:r>
-    </w:p>
-    <w:p>
-      <w:pPr>
-        <w:pStyle w:val="ListBullet"/>
-        <w:spacing w:after="80"/>
-        <w:ind w:left="540" w:hanging="271"/>
-      </w:pPr>
-      <w:r>
-        <w:t>Status and detailed acceptance evidence are summarized from the former sprint-specific records.</w:t>
-      </w:r>
-    </w:p>
-    <w:p>
-      <w:pPr>
-        <w:pStyle w:val="ListBullet"/>
-        <w:spacing w:after="80"/>
-        <w:ind w:left="540" w:hanging="271"/>
-      </w:pPr>
-      <w:r>
-        <w:t>Current behavior must be verified through the Test and QA Manual and retained directives.</w:t>
       </w:r>
     </w:p>
     <w:p>
@@ -842,26 +537,6 @@
     </w:p>
     <w:p>
       <w:pPr>
-        <w:pStyle w:val="ListBullet"/>
-        <w:spacing w:after="80"/>
-        <w:ind w:left="540" w:hanging="271"/>
-      </w:pPr>
-      <w:r>
-        <w:t>Status and detailed acceptance evidence are summarized from the former sprint-specific records.</w:t>
-      </w:r>
-    </w:p>
-    <w:p>
-      <w:pPr>
-        <w:pStyle w:val="ListBullet"/>
-        <w:spacing w:after="80"/>
-        <w:ind w:left="540" w:hanging="271"/>
-      </w:pPr>
-      <w:r>
-        <w:t>Current behavior must be verified through the Test and QA Manual and retained directives.</w:t>
-      </w:r>
-    </w:p>
-    <w:p>
-      <w:pPr>
         <w:pStyle w:val="Heading1"/>
       </w:pPr>
       <w:r>
@@ -875,12 +550,15 @@
     </w:p>
     <w:p>
       <w:pPr>
-        <w:pStyle w:val="ListBullet"/>
-        <w:spacing w:after="80"/>
-        <w:ind w:left="540" w:hanging="271"/>
+        <w:pStyle w:val="Heading1"/>
       </w:pPr>
       <w:r>
-        <w:t>Status and detailed acceptance evidence are summarized from the former sprint-specific records.</w:t>
+        <w:t>Sprint 18 (planned)</w:t>
+      </w:r>
+    </w:p>
+    <w:p>
+      <w:r>
+        <w:t>Review code quality, architectural conformance, and security across frontend, native, persistence, import, execution, CI, and packaging boundaries; validate findings before remediation and publish a redacted readiness record.</w:t>
       </w:r>
     </w:p>
     <w:p>
@@ -890,7 +568,17 @@
         <w:ind w:left="540" w:hanging="271"/>
       </w:pPr>
       <w:r>
-        <w:t>Current behavior must be verified through the Test and QA Manual and retained directives.</w:t>
+        <w:t>Status: planned; no implementation evidence is claimed.</w:t>
+      </w:r>
+    </w:p>
+    <w:p>
+      <w:pPr>
+        <w:pStyle w:val="ListBullet"/>
+        <w:spacing w:after="80"/>
+        <w:ind w:left="540" w:hanging="271"/>
+      </w:pPr>
+      <w:r>
+        <w:t>Detailed objectives and acceptance criteria remain in the retained sprint plans.</w:t>
       </w:r>
     </w:p>
     <w:p>

</xml_diff>